<commit_message>
docs: refine bilateral memo wording and pagination
Co-authored-by: McFeel <McFeel@users.noreply.github.com>
</commit_message>
<xml_diff>
--- a/qinghai-haidong/青海海东智算中心节能降碳与综合节能大模型合作备忘录_双方_文秘Codex_20260908.docx
+++ b/qinghai-haidong/青海海东智算中心节能降碳与综合节能大模型合作备忘录_双方_文秘Codex_20260908.docx
@@ -233,10 +233,9 @@
       <w:r>
         <w:rPr>
           <w:rFonts w:ascii="仿宋_GB2312" w:hAnsi="仿宋_GB2312" w:eastAsia="仿宋_GB2312" w:cs="仿宋_GB2312"/>
-          <w:b w:val="0"/>
           <w:sz w:val="32"/>
         </w:rPr>
-        <w:t>非签署方说明：广州恒运拟登记受让超算芯（项目SPV）80%股权，主导经营通过超算芯公司治理体现，具体股权受让及治理安排由股权转让文件另行约定。广州恒运不作为本备忘录签署方；本备忘录不据此在南网能源与广州恒运之间设立数据、模型开发、Token结算或其他合同关系。</w:t>
+        <w:t>非签署方说明：对外股权转让叙述采用“先受让”口径：广州恒运拟登记受让超算芯（项目SPV）80%股权，主导经营通过超算芯公司治理体现，具体股权受让及治理安排由股权转让文件另行约定。广州恒运不作为本备忘录签署方；本备忘录不据此在南网能源与广州恒运之间设立数据、模型开发、Token结算或其他合同关系。</w:t>
       </w:r>
     </w:p>
     <w:p>
@@ -882,6 +881,7 @@
     <w:p>
       <w:pPr>
         <w:keepNext/>
+        <w:pageBreakBefore/>
         <w:spacing w:before="200" w:after="100" w:lineRule="exact" w:line="400"/>
         <w:jc w:val="center"/>
       </w:pPr>

</xml_diff>